<commit_message>
Fix factual accuracy: five-principles attribution, UK AISI rename, GRIP delivery caveat
- Reattribute the five principles of agile regulation to Deloitte's The Future
  of Regulation (Eggers et al., 2018), noting WEF adoption, rather than crediting
  the WEF 2020 toolkit as their origin.
- Update UK 'AI Safety Institute' to 'AI Security Institute' (renamed early 2025).
- Add a GRIP delivery-status caveat (Playbook/Index still being built) and the
  Regulatory Frontier 'regulation as infrastructure' framing.
- Soften the Innovation Hub description.

Co-Authored-By: Claude Opus 4.8 <noreply@anthropic.com>
Claude-Session: https://claude.ai/code/session_01NDVXzFC44p5xn3JwqHG8XQ
</commit_message>
<xml_diff>
--- a/GRIP_Cheat_Sheet.docx
+++ b/GRIP_Cheat_Sheet.docx
@@ -425,7 +425,47 @@
           <w:sz w:val="21"/>
           <w:szCs w:val="21"/>
         </w:rPr>
-        <w:t xml:space="preserve">Five agile principles:</w:t>
+        <w:t xml:space="preserve">Five agile principles</w:t>
+      </w:r>
+      <w:r>
+        <w:rPr>
+          <w:rFonts w:ascii="Georgia" w:cs="Georgia" w:eastAsia="Georgia" w:hAnsi="Georgia"/>
+          <w:color w:val="1A1A1A"/>
+          <w:sz w:val="21"/>
+          <w:szCs w:val="21"/>
+        </w:rPr>
+        <w:t xml:space="preserve"> (Deloitte, </w:t>
+      </w:r>
+      <w:r>
+        <w:rPr>
+          <w:rFonts w:ascii="Georgia" w:cs="Georgia" w:eastAsia="Georgia" w:hAnsi="Georgia"/>
+          <w:i/>
+          <w:iCs/>
+          <w:color w:val="1A1A1A"/>
+          <w:sz w:val="21"/>
+          <w:szCs w:val="21"/>
+        </w:rPr>
+        <w:t xml:space="preserve">Future of Regulation</w:t>
+      </w:r>
+      <w:r>
+        <w:rPr>
+          <w:rFonts w:ascii="Georgia" w:cs="Georgia" w:eastAsia="Georgia" w:hAnsi="Georgia"/>
+          <w:color w:val="1A1A1A"/>
+          <w:sz w:val="21"/>
+          <w:szCs w:val="21"/>
+        </w:rPr>
+        <w:t xml:space="preserve">, 2018; adopted into WEF practice)</w:t>
+      </w:r>
+      <w:r>
+        <w:rPr>
+          <w:rFonts w:ascii="Georgia" w:cs="Georgia" w:eastAsia="Georgia" w:hAnsi="Georgia"/>
+          <w:b/>
+          <w:bCs/>
+          <w:color w:val="1A1A1A"/>
+          <w:sz w:val="21"/>
+          <w:szCs w:val="21"/>
+        </w:rPr>
+        <w:t xml:space="preserve">:</w:t>
       </w:r>
       <w:r>
         <w:rPr>
@@ -1911,7 +1951,7 @@
           <w:sz w:val="21"/>
           <w:szCs w:val="21"/>
         </w:rPr>
-        <w:t xml:space="preserve">Agile Governance: Reimagining Policy-making in the 4IR · Agile Regulation for the 4IR — Toolkit for Regulators (2020, the five principles) · Global Technology Governance Report (2021) · The Regulatory Frontier / GRIP (2025) · Global Risks Report · Future of Jobs Report.</w:t>
+        <w:t xml:space="preserve">Agile Governance: Reimagining Policy-making in the 4IR · Agile Regulation for the 4IR — Toolkit for Regulators (2020) · Global Technology Governance Report (2021) · The Regulatory Frontier / GRIP (2025) · Global Risks Report · Future of Jobs Report.</w:t>
       </w:r>
     </w:p>
     <w:p>

</xml_diff>